<commit_message>
docs: documentacao completa final (Sprints 1 a 6)
Adiciona documentacao unificada com todas as sprints, incluindo
Sprint 6 (API Gateway Edge, capacitacao da equipe e pagamentos).
Inclui geradores Python e documentos de sprints individuais.

Co-Authored-By: Claude Opus 4.6 (1M context) <noreply@anthropic.com>
</commit_message>
<xml_diff>
--- a/docs/Semana 3.docx
+++ b/docs/Semana 3.docx
@@ -370,7 +370,7 @@
                 <w:noProof/>
                 <w:webHidden/>
               </w:rPr>
-              <w:t>6</w:t>
+              <w:t>5</w:t>
             </w:r>
             <w:r>
               <w:rPr>
@@ -443,7 +443,7 @@
                 <w:noProof/>
                 <w:webHidden/>
               </w:rPr>
-              <w:t>6</w:t>
+              <w:t>5</w:t>
             </w:r>
             <w:r>
               <w:rPr>
@@ -516,7 +516,7 @@
                 <w:noProof/>
                 <w:webHidden/>
               </w:rPr>
-              <w:t>6</w:t>
+              <w:t>5</w:t>
             </w:r>
             <w:r>
               <w:rPr>
@@ -589,7 +589,7 @@
                 <w:noProof/>
                 <w:webHidden/>
               </w:rPr>
-              <w:t>7</w:t>
+              <w:t>6</w:t>
             </w:r>
             <w:r>
               <w:rPr>
@@ -662,7 +662,7 @@
                 <w:noProof/>
                 <w:webHidden/>
               </w:rPr>
-              <w:t>7</w:t>
+              <w:t>6</w:t>
             </w:r>
             <w:r>
               <w:rPr>
@@ -735,7 +735,7 @@
                 <w:noProof/>
                 <w:webHidden/>
               </w:rPr>
-              <w:t>7</w:t>
+              <w:t>6</w:t>
             </w:r>
             <w:r>
               <w:rPr>
@@ -808,7 +808,7 @@
                 <w:noProof/>
                 <w:webHidden/>
               </w:rPr>
-              <w:t>8</w:t>
+              <w:t>7</w:t>
             </w:r>
             <w:r>
               <w:rPr>
@@ -881,7 +881,7 @@
                 <w:noProof/>
                 <w:webHidden/>
               </w:rPr>
-              <w:t>8</w:t>
+              <w:t>7</w:t>
             </w:r>
             <w:r>
               <w:rPr>
@@ -954,7 +954,7 @@
                 <w:noProof/>
                 <w:webHidden/>
               </w:rPr>
-              <w:t>8</w:t>
+              <w:t>7</w:t>
             </w:r>
             <w:r>
               <w:rPr>
@@ -1027,7 +1027,7 @@
                 <w:noProof/>
                 <w:webHidden/>
               </w:rPr>
-              <w:t>8</w:t>
+              <w:t>7</w:t>
             </w:r>
             <w:r>
               <w:rPr>
@@ -1100,7 +1100,7 @@
                 <w:noProof/>
                 <w:webHidden/>
               </w:rPr>
-              <w:t>9</w:t>
+              <w:t>8</w:t>
             </w:r>
             <w:r>
               <w:rPr>
@@ -1173,7 +1173,7 @@
                 <w:noProof/>
                 <w:webHidden/>
               </w:rPr>
-              <w:t>9</w:t>
+              <w:t>8</w:t>
             </w:r>
             <w:r>
               <w:rPr>
@@ -1246,7 +1246,7 @@
                 <w:noProof/>
                 <w:webHidden/>
               </w:rPr>
-              <w:t>9</w:t>
+              <w:t>8</w:t>
             </w:r>
             <w:r>
               <w:rPr>
@@ -1319,7 +1319,7 @@
                 <w:noProof/>
                 <w:webHidden/>
               </w:rPr>
-              <w:t>9</w:t>
+              <w:t>8</w:t>
             </w:r>
             <w:r>
               <w:rPr>
@@ -1392,7 +1392,7 @@
                 <w:noProof/>
                 <w:webHidden/>
               </w:rPr>
-              <w:t>10</w:t>
+              <w:t>9</w:t>
             </w:r>
             <w:r>
               <w:rPr>
@@ -1465,7 +1465,7 @@
                 <w:noProof/>
                 <w:webHidden/>
               </w:rPr>
-              <w:t>10</w:t>
+              <w:t>9</w:t>
             </w:r>
             <w:r>
               <w:rPr>
@@ -1538,7 +1538,7 @@
                 <w:noProof/>
                 <w:webHidden/>
               </w:rPr>
-              <w:t>10</w:t>
+              <w:t>9</w:t>
             </w:r>
             <w:r>
               <w:rPr>
@@ -1611,7 +1611,7 @@
                 <w:noProof/>
                 <w:webHidden/>
               </w:rPr>
-              <w:t>10</w:t>
+              <w:t>9</w:t>
             </w:r>
             <w:r>
               <w:rPr>
@@ -1684,7 +1684,7 @@
                 <w:noProof/>
                 <w:webHidden/>
               </w:rPr>
-              <w:t>10</w:t>
+              <w:t>9</w:t>
             </w:r>
             <w:r>
               <w:rPr>
@@ -1757,7 +1757,7 @@
                 <w:noProof/>
                 <w:webHidden/>
               </w:rPr>
-              <w:t>11</w:t>
+              <w:t>10</w:t>
             </w:r>
             <w:r>
               <w:rPr>
@@ -1830,7 +1830,7 @@
                 <w:noProof/>
                 <w:webHidden/>
               </w:rPr>
-              <w:t>11</w:t>
+              <w:t>10</w:t>
             </w:r>
             <w:r>
               <w:rPr>
@@ -1903,7 +1903,7 @@
                 <w:noProof/>
                 <w:webHidden/>
               </w:rPr>
-              <w:t>11</w:t>
+              <w:t>10</w:t>
             </w:r>
             <w:r>
               <w:rPr>
@@ -1976,7 +1976,7 @@
                 <w:noProof/>
                 <w:webHidden/>
               </w:rPr>
-              <w:t>11</w:t>
+              <w:t>10</w:t>
             </w:r>
             <w:r>
               <w:rPr>
@@ -2049,7 +2049,7 @@
                 <w:noProof/>
                 <w:webHidden/>
               </w:rPr>
-              <w:t>11</w:t>
+              <w:t>10</w:t>
             </w:r>
             <w:r>
               <w:rPr>
@@ -2122,7 +2122,7 @@
                 <w:noProof/>
                 <w:webHidden/>
               </w:rPr>
-              <w:t>12</w:t>
+              <w:t>11</w:t>
             </w:r>
             <w:r>
               <w:rPr>
@@ -2195,7 +2195,7 @@
                 <w:noProof/>
                 <w:webHidden/>
               </w:rPr>
-              <w:t>12</w:t>
+              <w:t>11</w:t>
             </w:r>
             <w:r>
               <w:rPr>
@@ -2268,7 +2268,7 @@
                 <w:noProof/>
                 <w:webHidden/>
               </w:rPr>
-              <w:t>13</w:t>
+              <w:t>12</w:t>
             </w:r>
             <w:r>
               <w:rPr>
@@ -2341,7 +2341,7 @@
                 <w:noProof/>
                 <w:webHidden/>
               </w:rPr>
-              <w:t>13</w:t>
+              <w:t>12</w:t>
             </w:r>
             <w:r>
               <w:rPr>
@@ -2414,7 +2414,7 @@
                 <w:noProof/>
                 <w:webHidden/>
               </w:rPr>
-              <w:t>15</w:t>
+              <w:t>14</w:t>
             </w:r>
             <w:r>
               <w:rPr>

</xml_diff>